<commit_message>
cosmetic still phase correct PWM for CTC
</commit_message>
<xml_diff>
--- a/Thermoino_PWM.docx
+++ b/Thermoino_PWM.docx
@@ -2192,7 +2192,7 @@
           <w:lang w:eastAsia="de-DE"/>
         </w:rPr>
         <w:drawing>
-          <wp:inline distT="0" distB="0" distL="0" distR="0" wp14:anchorId="7647E27D" wp14:editId="1DAD200C">
+          <wp:inline distT="0" distB="0" distL="0" distR="0" wp14:anchorId="7647E27D" wp14:editId="4EDA78B0">
             <wp:extent cx="5760720" cy="3240405"/>
             <wp:effectExtent l="0" t="0" r="0" b="0"/>
             <wp:docPr id="17" name="Grafik 17" descr="C:\Users\buechel\Dropbox\DSC_0091.JPG"/>
@@ -2815,7 +2815,7 @@
           <w:lang w:eastAsia="de-DE"/>
         </w:rPr>
         <w:drawing>
-          <wp:inline distT="0" distB="0" distL="0" distR="0" wp14:anchorId="0F982661" wp14:editId="02DAC466">
+          <wp:inline distT="0" distB="0" distL="0" distR="0" wp14:anchorId="0F982661" wp14:editId="284DE1C1">
             <wp:extent cx="5760720" cy="3240405"/>
             <wp:effectExtent l="0" t="0" r="0" b="0"/>
             <wp:docPr id="26" name="Grafik 26" descr="C:\Users\buechel\Dropbox\DSC_0093.JPG"/>
@@ -3085,7 +3085,7 @@
           <w:lang w:eastAsia="de-DE"/>
         </w:rPr>
         <w:drawing>
-          <wp:inline distT="0" distB="0" distL="0" distR="0" wp14:anchorId="21CF7B22" wp14:editId="0D2C9848">
+          <wp:inline distT="0" distB="0" distL="0" distR="0" wp14:anchorId="21CF7B22" wp14:editId="4D253ACE">
             <wp:extent cx="5760720" cy="3240405"/>
             <wp:effectExtent l="0" t="0" r="0" b="0"/>
             <wp:docPr id="14" name="Grafik 14" descr="C:\Users\buechel\Dropbox\DSCPDC_0003_BURST20210519130452590_COVER.JPG"/>
@@ -3788,6 +3788,9 @@
     </w:p>
     <w:p>
       <w:r>
+        <w:rPr>
+          <w:noProof/>
+        </w:rPr>
         <w:drawing>
           <wp:inline distT="0" distB="0" distL="0" distR="0" wp14:anchorId="444BB5B5" wp14:editId="1DFC9684">
             <wp:extent cx="5760720" cy="3375660"/>
@@ -3859,6 +3862,9 @@
     </w:p>
     <w:p>
       <w:r>
+        <w:rPr>
+          <w:noProof/>
+        </w:rPr>
         <w:lastRenderedPageBreak/>
         <w:drawing>
           <wp:inline distT="0" distB="0" distL="0" distR="0" wp14:anchorId="721C662C" wp14:editId="7864507F">
@@ -3925,6 +3931,9 @@
     </w:p>
     <w:p>
       <w:r>
+        <w:rPr>
+          <w:noProof/>
+        </w:rPr>
         <w:drawing>
           <wp:inline distT="0" distB="0" distL="0" distR="0" wp14:anchorId="60D81FC0" wp14:editId="1F800D28">
             <wp:extent cx="5760720" cy="3375660"/>
@@ -4003,6 +4012,9 @@
     </w:p>
     <w:p>
       <w:r>
+        <w:rPr>
+          <w:noProof/>
+        </w:rPr>
         <w:lastRenderedPageBreak/>
         <w:drawing>
           <wp:inline distT="0" distB="0" distL="0" distR="0" wp14:anchorId="5D01AFD0" wp14:editId="18BA752D">
@@ -4069,10 +4081,290 @@
     </w:p>
     <w:p>
       <w:pPr>
-        <w:rPr>
-          <w:lang w:val="en-US"/>
-        </w:rPr>
-      </w:pPr>
+        <w:pStyle w:val="berschrift1"/>
+        <w:rPr>
+          <w:lang w:val="en-US"/>
+        </w:rPr>
+      </w:pPr>
+      <w:r>
+        <w:rPr>
+          <w:lang w:val="en-US"/>
+        </w:rPr>
+        <w:t>Update Dec/Jan 2025/26</w:t>
+      </w:r>
+    </w:p>
+    <w:p>
+      <w:pPr>
+        <w:rPr>
+          <w:lang w:val="en-US"/>
+        </w:rPr>
+      </w:pPr>
+      <w:r>
+        <w:rPr>
+          <w:lang w:val="en-US"/>
+        </w:rPr>
+        <w:t>I have now ported the program to the 32u4 (Micro, Leonardo) platform as they have a faster USB interface (on-chip). While doing this I noticed that using an additional Timer is not required, so the program only uses Timer1 and Timer3. The 32u4 has only 2.5kByte RAM so the CTC array needed to be smaller. Given that entries could not be bigger than 500 it was a waste to use 16bit values. I have now made this full dynamic and everything is encoded in a bit-stream, i.e. Given the CTC period it is decided how many bits we need. That is important as shorter periods require more entries.</w:t>
+      </w:r>
+    </w:p>
+    <w:p>
+      <w:pPr>
+        <w:pStyle w:val="berschrift1"/>
+        <w:rPr>
+          <w:lang w:val="en-US"/>
+        </w:rPr>
+      </w:pPr>
+      <w:r>
+        <w:rPr>
+          <w:lang w:val="en-US"/>
+        </w:rPr>
+        <w:t>Update 22.1.26</w:t>
+      </w:r>
+    </w:p>
+    <w:p>
+      <w:pPr>
+        <w:rPr>
+          <w:lang w:val="en-US"/>
+        </w:rPr>
+      </w:pPr>
+      <w:r>
+        <w:rPr>
+          <w:lang w:val="en-US"/>
+        </w:rPr>
+        <w:t>Now has support for the D188 electrode multiplexer box and sends 4-bit coded data to a Sub-D 25. The command is D188;xx where xx is the channel you want (0..8) and 0 means off</w:t>
+      </w:r>
+      <w:r>
+        <w:rPr>
+          <w:lang w:val="en-US"/>
+        </w:rPr>
+        <w:t>.</w:t>
+      </w:r>
+    </w:p>
+    <w:p>
+      <w:pPr>
+        <w:rPr>
+          <w:lang w:val="en-US"/>
+        </w:rPr>
+      </w:pPr>
+      <w:r>
+        <w:rPr>
+          <w:lang w:val="en-US"/>
+        </w:rPr>
+        <w:t xml:space="preserve">I have also included code to talk to a </w:t>
+      </w:r>
+      <w:r>
+        <w:rPr>
+          <w:lang w:val="en-US"/>
+        </w:rPr>
+        <w:t xml:space="preserve">2-Channel I2C DAC module </w:t>
+      </w:r>
+      <w:r>
+        <w:rPr>
+          <w:lang w:val="en-US"/>
+        </w:rPr>
+        <w:t xml:space="preserve">that </w:t>
+      </w:r>
+      <w:r>
+        <w:rPr>
+          <w:lang w:val="en-US"/>
+        </w:rPr>
+        <w:t>can output a voltage of 0-10V</w:t>
+      </w:r>
+      <w:r>
+        <w:rPr>
+          <w:lang w:val="en-US"/>
+        </w:rPr>
+        <w:t xml:space="preserve"> (using a </w:t>
+      </w:r>
+      <w:r>
+        <w:rPr>
+          <w:lang w:val="en-US"/>
+        </w:rPr>
+        <w:t>GP8403</w:t>
+      </w:r>
+      <w:r>
+        <w:rPr>
+          <w:lang w:val="en-US"/>
+        </w:rPr>
+        <w:t>). This works quite nicely and uses the command SETV;xx where xx is the voltage in mV (0..10000). This uses wire.h and thus hardware I2C</w:t>
+      </w:r>
+      <w:r>
+        <w:rPr>
+          <w:lang w:val="en-US"/>
+        </w:rPr>
+        <w:t>.</w:t>
+      </w:r>
+      <w:r>
+        <w:rPr>
+          <w:lang w:val="en-US"/>
+        </w:rPr>
+        <w:t xml:space="preserve"> </w:t>
+      </w:r>
+      <w:r>
+        <w:rPr>
+          <w:lang w:val="en-US"/>
+        </w:rPr>
+        <w:t>T</w:t>
+      </w:r>
+      <w:r>
+        <w:rPr>
+          <w:lang w:val="en-US"/>
+        </w:rPr>
+        <w:t>he 2560 needs to use pins 20 and 21. On the Leonardo</w:t>
+      </w:r>
+      <w:r>
+        <w:rPr>
+          <w:lang w:val="en-US"/>
+        </w:rPr>
+        <w:t xml:space="preserve"> its pins 2 and 3. Interestingly, the Micro (official Arduino) I have tested works, but the Pro Micro (Chinese clone) crashes. This might be due to I2C pull-up problems. What I see is (when sending setv;10000 that the voltage briefly increases and then decreases again. Afterwards the device is not responsive anymore. </w:t>
+      </w:r>
+    </w:p>
+    <w:p>
+      <w:pPr>
+        <w:rPr>
+          <w:lang w:val="en-US"/>
+        </w:rPr>
+      </w:pPr>
+      <w:r>
+        <w:rPr>
+          <w:lang w:val="en-US"/>
+        </w:rPr>
+        <w:t xml:space="preserve">Here is the switching time course of the DA </w:t>
+      </w:r>
+    </w:p>
+    <w:p>
+      <w:pPr>
+        <w:rPr>
+          <w:lang w:val="en-US"/>
+        </w:rPr>
+      </w:pPr>
+      <w:r>
+        <w:rPr>
+          <w:noProof/>
+          <w:lang w:val="en-US"/>
+        </w:rPr>
+        <w:lastRenderedPageBreak/>
+        <w:drawing>
+          <wp:inline distT="0" distB="0" distL="0" distR="0" wp14:anchorId="3F051829" wp14:editId="6E64CA35">
+            <wp:extent cx="5760720" cy="3375660"/>
+            <wp:effectExtent l="0" t="0" r="0" b="0"/>
+            <wp:docPr id="200215672" name="Grafik 1"/>
+            <wp:cNvGraphicFramePr>
+              <a:graphicFrameLocks xmlns:a="http://schemas.openxmlformats.org/drawingml/2006/main" noChangeAspect="1"/>
+            </wp:cNvGraphicFramePr>
+            <a:graphic xmlns:a="http://schemas.openxmlformats.org/drawingml/2006/main">
+              <a:graphicData uri="http://schemas.openxmlformats.org/drawingml/2006/picture">
+                <pic:pic xmlns:pic="http://schemas.openxmlformats.org/drawingml/2006/picture">
+                  <pic:nvPicPr>
+                    <pic:cNvPr id="200215672" name="Grafik 200215672"/>
+                    <pic:cNvPicPr/>
+                  </pic:nvPicPr>
+                  <pic:blipFill>
+                    <a:blip r:embed="rId35">
+                      <a:extLst>
+                        <a:ext uri="{28A0092B-C50C-407E-A947-70E740481C1C}">
+                          <a14:useLocalDpi xmlns:a14="http://schemas.microsoft.com/office/drawing/2010/main" val="0"/>
+                        </a:ext>
+                      </a:extLst>
+                    </a:blip>
+                    <a:stretch>
+                      <a:fillRect/>
+                    </a:stretch>
+                  </pic:blipFill>
+                  <pic:spPr>
+                    <a:xfrm>
+                      <a:off x="0" y="0"/>
+                      <a:ext cx="5760720" cy="3375660"/>
+                    </a:xfrm>
+                    <a:prstGeom prst="rect">
+                      <a:avLst/>
+                    </a:prstGeom>
+                  </pic:spPr>
+                </pic:pic>
+              </a:graphicData>
+            </a:graphic>
+          </wp:inline>
+        </w:drawing>
+      </w:r>
+    </w:p>
+    <w:p>
+      <w:pPr>
+        <w:rPr>
+          <w:lang w:val="en-US"/>
+        </w:rPr>
+      </w:pPr>
+      <w:r>
+        <w:rPr>
+          <w:lang w:val="en-US"/>
+        </w:rPr>
+        <w:t>From 0 to 10V</w:t>
+      </w:r>
+    </w:p>
+    <w:p>
+      <w:pPr>
+        <w:rPr>
+          <w:lang w:val="en-US"/>
+        </w:rPr>
+      </w:pPr>
+      <w:r>
+        <w:rPr>
+          <w:noProof/>
+          <w:lang w:val="en-US"/>
+        </w:rPr>
+        <w:drawing>
+          <wp:inline distT="0" distB="0" distL="0" distR="0" wp14:anchorId="600AD856" wp14:editId="2BAE3CFB">
+            <wp:extent cx="5760720" cy="3375660"/>
+            <wp:effectExtent l="0" t="0" r="0" b="0"/>
+            <wp:docPr id="1482110230" name="Grafik 2"/>
+            <wp:cNvGraphicFramePr>
+              <a:graphicFrameLocks xmlns:a="http://schemas.openxmlformats.org/drawingml/2006/main" noChangeAspect="1"/>
+            </wp:cNvGraphicFramePr>
+            <a:graphic xmlns:a="http://schemas.openxmlformats.org/drawingml/2006/main">
+              <a:graphicData uri="http://schemas.openxmlformats.org/drawingml/2006/picture">
+                <pic:pic xmlns:pic="http://schemas.openxmlformats.org/drawingml/2006/picture">
+                  <pic:nvPicPr>
+                    <pic:cNvPr id="1482110230" name="Grafik 1482110230"/>
+                    <pic:cNvPicPr/>
+                  </pic:nvPicPr>
+                  <pic:blipFill>
+                    <a:blip r:embed="rId36">
+                      <a:extLst>
+                        <a:ext uri="{28A0092B-C50C-407E-A947-70E740481C1C}">
+                          <a14:useLocalDpi xmlns:a14="http://schemas.microsoft.com/office/drawing/2010/main" val="0"/>
+                        </a:ext>
+                      </a:extLst>
+                    </a:blip>
+                    <a:stretch>
+                      <a:fillRect/>
+                    </a:stretch>
+                  </pic:blipFill>
+                  <pic:spPr>
+                    <a:xfrm>
+                      <a:off x="0" y="0"/>
+                      <a:ext cx="5760720" cy="3375660"/>
+                    </a:xfrm>
+                    <a:prstGeom prst="rect">
+                      <a:avLst/>
+                    </a:prstGeom>
+                  </pic:spPr>
+                </pic:pic>
+              </a:graphicData>
+            </a:graphic>
+          </wp:inline>
+        </w:drawing>
+      </w:r>
+    </w:p>
+    <w:p>
+      <w:pPr>
+        <w:rPr>
+          <w:lang w:val="en-US"/>
+        </w:rPr>
+      </w:pPr>
+      <w:r>
+        <w:rPr>
+          <w:lang w:val="en-US"/>
+        </w:rPr>
+        <w:t>And back to 0V. Reasonable timing, I guess it is safe to wait for 1ms then the voltage should have settled</w:t>
+      </w:r>
     </w:p>
     <w:sectPr>
       <w:pgSz w:w="11906" w:h="16838"/>

</xml_diff>

<commit_message>
new SEQU feature added for DS8, range check updated
</commit_message>
<xml_diff>
--- a/Thermoino_PWM.docx
+++ b/Thermoino_PWM.docx
@@ -1357,7 +1357,21 @@
         <w:rPr>
           <w:lang w:val="en-US"/>
         </w:rPr>
-        <w:t xml:space="preserve">We are using a 16 bit timer, timer1 in phase correct PWM mode (mode 10). </w:t>
+        <w:t xml:space="preserve">We are using a </w:t>
+      </w:r>
+      <w:proofErr w:type="gramStart"/>
+      <w:r>
+        <w:rPr>
+          <w:lang w:val="en-US"/>
+        </w:rPr>
+        <w:t>16 bit</w:t>
+      </w:r>
+      <w:proofErr w:type="gramEnd"/>
+      <w:r>
+        <w:rPr>
+          <w:lang w:val="en-US"/>
+        </w:rPr>
+        <w:t xml:space="preserve"> timer, timer1 in phase correct PWM mode (mode 10). </w:t>
       </w:r>
     </w:p>
     <w:p>
@@ -1431,7 +1445,21 @@
         <w:rPr>
           <w:lang w:val="en-US"/>
         </w:rPr>
-        <w:t>Timing is set by the prescaler:</w:t>
+        <w:t xml:space="preserve">Timing is set by the </w:t>
+      </w:r>
+      <w:proofErr w:type="spellStart"/>
+      <w:r>
+        <w:rPr>
+          <w:lang w:val="en-US"/>
+        </w:rPr>
+        <w:t>prescaler</w:t>
+      </w:r>
+      <w:proofErr w:type="spellEnd"/>
+      <w:r>
+        <w:rPr>
+          <w:lang w:val="en-US"/>
+        </w:rPr>
+        <w:t>:</w:t>
       </w:r>
     </w:p>
     <w:p>
@@ -1505,7 +1533,63 @@
         <w:rPr>
           <w:lang w:val="en-US"/>
         </w:rPr>
-        <w:t>And we are using a prescaler of 64. The Mega2560 runs at 16MHz, prescale by 64 gives a tick per 4us. This is a good divider if we want ms resolution, ie 1ms = 250 ticks.</w:t>
+        <w:t xml:space="preserve">And we are using a </w:t>
+      </w:r>
+      <w:proofErr w:type="spellStart"/>
+      <w:r>
+        <w:rPr>
+          <w:lang w:val="en-US"/>
+        </w:rPr>
+        <w:t>prescaler</w:t>
+      </w:r>
+      <w:proofErr w:type="spellEnd"/>
+      <w:r>
+        <w:rPr>
+          <w:lang w:val="en-US"/>
+        </w:rPr>
+        <w:t xml:space="preserve"> of 64. The Mega2560 runs at 16MHz, </w:t>
+      </w:r>
+      <w:proofErr w:type="spellStart"/>
+      <w:r>
+        <w:rPr>
+          <w:lang w:val="en-US"/>
+        </w:rPr>
+        <w:t>prescale</w:t>
+      </w:r>
+      <w:proofErr w:type="spellEnd"/>
+      <w:r>
+        <w:rPr>
+          <w:lang w:val="en-US"/>
+        </w:rPr>
+        <w:t xml:space="preserve"> by 64 gives a tick per 4us. This is a good divider if we want </w:t>
+      </w:r>
+      <w:proofErr w:type="spellStart"/>
+      <w:r>
+        <w:rPr>
+          <w:lang w:val="en-US"/>
+        </w:rPr>
+        <w:t>ms</w:t>
+      </w:r>
+      <w:proofErr w:type="spellEnd"/>
+      <w:r>
+        <w:rPr>
+          <w:lang w:val="en-US"/>
+        </w:rPr>
+        <w:t xml:space="preserve"> resolution, </w:t>
+      </w:r>
+      <w:proofErr w:type="spellStart"/>
+      <w:r>
+        <w:rPr>
+          <w:lang w:val="en-US"/>
+        </w:rPr>
+        <w:t>ie</w:t>
+      </w:r>
+      <w:proofErr w:type="spellEnd"/>
+      <w:r>
+        <w:rPr>
+          <w:lang w:val="en-US"/>
+        </w:rPr>
+        <w:t xml:space="preserve"> 1ms = 250 ticks.</w:t>
       </w:r>
     </w:p>
     <w:p>
@@ -1617,7 +1701,35 @@
         <w:rPr>
           <w:lang w:val="en-US"/>
         </w:rPr>
-        <w:t xml:space="preserve">Now how to change pulse width from cycle to cyle? Each time the counter (TCNT1) hits the bottom an interrupt is fired (timer overflow) which we can service using </w:t>
+        <w:t xml:space="preserve">Now how </w:t>
+      </w:r>
+      <w:proofErr w:type="gramStart"/>
+      <w:r>
+        <w:rPr>
+          <w:lang w:val="en-US"/>
+        </w:rPr>
+        <w:t>to</w:t>
+      </w:r>
+      <w:proofErr w:type="gramEnd"/>
+      <w:r>
+        <w:rPr>
+          <w:lang w:val="en-US"/>
+        </w:rPr>
+        <w:t xml:space="preserve"> change pulse width from cycle to </w:t>
+      </w:r>
+      <w:proofErr w:type="spellStart"/>
+      <w:r>
+        <w:rPr>
+          <w:lang w:val="en-US"/>
+        </w:rPr>
+        <w:t>cyle</w:t>
+      </w:r>
+      <w:proofErr w:type="spellEnd"/>
+      <w:r>
+        <w:rPr>
+          <w:lang w:val="en-US"/>
+        </w:rPr>
+        <w:t xml:space="preserve">? Each time the counter (TCNT1) hits the bottom an interrupt is fired (timer overflow) which we can service using </w:t>
       </w:r>
     </w:p>
     <w:p>
@@ -1643,7 +1755,21 @@
         <w:rPr>
           <w:lang w:val="en-US"/>
         </w:rPr>
-        <w:t xml:space="preserve">In this interrupt handler we simply set the new values for OCR1A and OCR1B. Note however, that these only come into effect at the next peak, because OCR1X are double buffered registers.  </w:t>
+        <w:t xml:space="preserve">In this </w:t>
+      </w:r>
+      <w:proofErr w:type="gramStart"/>
+      <w:r>
+        <w:rPr>
+          <w:lang w:val="en-US"/>
+        </w:rPr>
+        <w:t>interrupt</w:t>
+      </w:r>
+      <w:proofErr w:type="gramEnd"/>
+      <w:r>
+        <w:rPr>
+          <w:lang w:val="en-US"/>
+        </w:rPr>
+        <w:t xml:space="preserve"> handler we simply set the new values for OCR1A and OCR1B. Note however, that these only come into effect at the next peak, because OCR1X are double buffered registers.  </w:t>
       </w:r>
     </w:p>
     <w:p>
@@ -2056,7 +2182,23 @@
         <w:rPr>
           <w:lang w:val="en-US"/>
         </w:rPr>
-        <w:t>Now this gets better if the pullup gets smaller, using 470R get’s us the following</w:t>
+        <w:t xml:space="preserve">Now this gets better if the pullup gets smaller, using 470R </w:t>
+      </w:r>
+      <w:proofErr w:type="spellStart"/>
+      <w:proofErr w:type="gramStart"/>
+      <w:r>
+        <w:rPr>
+          <w:lang w:val="en-US"/>
+        </w:rPr>
+        <w:t>get’s</w:t>
+      </w:r>
+      <w:proofErr w:type="spellEnd"/>
+      <w:proofErr w:type="gramEnd"/>
+      <w:r>
+        <w:rPr>
+          <w:lang w:val="en-US"/>
+        </w:rPr>
+        <w:t xml:space="preserve"> us the following</w:t>
       </w:r>
     </w:p>
     <w:p>
@@ -2119,18 +2261,48 @@
         </w:rPr>
         <w:t xml:space="preserve">A </w:t>
       </w:r>
-      <w:r>
-        <w:rPr>
-          <w:lang w:val="en-US"/>
-        </w:rPr>
-        <w:t xml:space="preserve">pretty consistent </w:t>
-      </w:r>
-      <w:r>
-        <w:rPr>
-          <w:lang w:val="en-US"/>
-        </w:rPr>
-        <w:t>2us onset and a 14us offset delay, this is constant at pulses &gt;100us, i.e. in the ms range we are ok</w:t>
-      </w:r>
+      <w:proofErr w:type="gramStart"/>
+      <w:r>
+        <w:rPr>
+          <w:lang w:val="en-US"/>
+        </w:rPr>
+        <w:t>pretty consistent</w:t>
+      </w:r>
+      <w:proofErr w:type="gramEnd"/>
+      <w:r>
+        <w:rPr>
+          <w:lang w:val="en-US"/>
+        </w:rPr>
+        <w:t xml:space="preserve"> </w:t>
+      </w:r>
+      <w:r>
+        <w:rPr>
+          <w:lang w:val="en-US"/>
+        </w:rPr>
+        <w:t xml:space="preserve">2us onset and a 14us offset delay, this is constant at pulses &gt;100us, i.e. in the </w:t>
+      </w:r>
+      <w:proofErr w:type="spellStart"/>
+      <w:r>
+        <w:rPr>
+          <w:lang w:val="en-US"/>
+        </w:rPr>
+        <w:t>ms</w:t>
+      </w:r>
+      <w:proofErr w:type="spellEnd"/>
+      <w:r>
+        <w:rPr>
+          <w:lang w:val="en-US"/>
+        </w:rPr>
+        <w:t xml:space="preserve"> range we are </w:t>
+      </w:r>
+      <w:proofErr w:type="gramStart"/>
+      <w:r>
+        <w:rPr>
+          <w:lang w:val="en-US"/>
+        </w:rPr>
+        <w:t>ok</w:t>
+      </w:r>
+      <w:proofErr w:type="gramEnd"/>
       <w:r>
         <w:rPr>
           <w:lang w:val="en-US"/>
@@ -2147,7 +2319,35 @@
         <w:rPr>
           <w:lang w:val="en-US"/>
         </w:rPr>
-        <w:t>12us too long … We have a timer resolution of 4us, but using count-up/down as in phase correct PWM, the actual resolution is 8us. So we could subtract one tick from every pulse which would bring down the error to 4us, but I guess that is overkill for the thermode…</w:t>
+        <w:t xml:space="preserve">12us too long … We have a timer resolution of </w:t>
+      </w:r>
+      <w:proofErr w:type="gramStart"/>
+      <w:r>
+        <w:rPr>
+          <w:lang w:val="en-US"/>
+        </w:rPr>
+        <w:t>4us, but</w:t>
+      </w:r>
+      <w:proofErr w:type="gramEnd"/>
+      <w:r>
+        <w:rPr>
+          <w:lang w:val="en-US"/>
+        </w:rPr>
+        <w:t xml:space="preserve"> using count-up/down as in phase correct PWM, the actual resolution is 8us. </w:t>
+      </w:r>
+      <w:proofErr w:type="gramStart"/>
+      <w:r>
+        <w:rPr>
+          <w:lang w:val="en-US"/>
+        </w:rPr>
+        <w:t>So</w:t>
+      </w:r>
+      <w:proofErr w:type="gramEnd"/>
+      <w:r>
+        <w:rPr>
+          <w:lang w:val="en-US"/>
+        </w:rPr>
+        <w:t xml:space="preserve"> we could subtract one tick from every pulse which would bring down the error to 4us, but I guess that is overkill for the thermode…</w:t>
       </w:r>
     </w:p>
     <w:p>
@@ -2192,7 +2392,7 @@
           <w:lang w:eastAsia="de-DE"/>
         </w:rPr>
         <w:drawing>
-          <wp:inline distT="0" distB="0" distL="0" distR="0" wp14:anchorId="7647E27D" wp14:editId="4EDA78B0">
+          <wp:inline distT="0" distB="0" distL="0" distR="0" wp14:anchorId="7647E27D" wp14:editId="0260320E">
             <wp:extent cx="5760720" cy="3240405"/>
             <wp:effectExtent l="0" t="0" r="0" b="0"/>
             <wp:docPr id="17" name="Grafik 17" descr="C:\Users\buechel\Dropbox\DSC_0091.JPG"/>
@@ -2251,20 +2451,42 @@
         <w:rPr>
           <w:lang w:val="en-US"/>
         </w:rPr>
-        <w:t>Pretty bad, a pulse of 1ms with heavy bleeding. Back to the drawing board. The idea was to use an optocoupler with an exposed base. This can be connected to GND (100k) to allow to quickly discharge the base capacitance. I had a few CNY 17-3 and looked at it in LTSpice. Based on the time constant, I guessed that the pullup in the thermode is about 220K. Voltage is about 2.7V.</w:t>
-      </w:r>
-    </w:p>
-    <w:p>
-      <w:pPr>
-        <w:rPr>
-          <w:lang w:val="en-US"/>
-        </w:rPr>
-      </w:pPr>
-      <w:r>
-        <w:rPr>
-          <w:lang w:val="en-US"/>
-        </w:rPr>
-        <w:t>So let’s see a simulation of the old PC817</w:t>
+        <w:t xml:space="preserve">Pretty bad, a pulse of 1ms with heavy bleeding. Back to the drawing board. The idea was to use an optocoupler with an exposed base. This can be connected to GND (100k) to allow to quickly discharge the base capacitance. I had a few CNY 17-3 and looked at it in </w:t>
+      </w:r>
+      <w:proofErr w:type="spellStart"/>
+      <w:r>
+        <w:rPr>
+          <w:lang w:val="en-US"/>
+        </w:rPr>
+        <w:t>LTSpice</w:t>
+      </w:r>
+      <w:proofErr w:type="spellEnd"/>
+      <w:r>
+        <w:rPr>
+          <w:lang w:val="en-US"/>
+        </w:rPr>
+        <w:t>. Based on the time constant, I guessed that the pullup in the thermode is about 220K. Voltage is about 2.7V.</w:t>
+      </w:r>
+    </w:p>
+    <w:p>
+      <w:pPr>
+        <w:rPr>
+          <w:lang w:val="en-US"/>
+        </w:rPr>
+      </w:pPr>
+      <w:proofErr w:type="gramStart"/>
+      <w:r>
+        <w:rPr>
+          <w:lang w:val="en-US"/>
+        </w:rPr>
+        <w:t>So</w:t>
+      </w:r>
+      <w:proofErr w:type="gramEnd"/>
+      <w:r>
+        <w:rPr>
+          <w:lang w:val="en-US"/>
+        </w:rPr>
+        <w:t xml:space="preserve"> let’s see a simulation of the old PC817</w:t>
       </w:r>
     </w:p>
     <w:p>
@@ -2545,7 +2767,21 @@
         <w:rPr>
           <w:lang w:val="en-US"/>
         </w:rPr>
-        <w:t>a very brief pulse of 16us with LTspice:</w:t>
+        <w:t xml:space="preserve">a very brief pulse of 16us with </w:t>
+      </w:r>
+      <w:proofErr w:type="spellStart"/>
+      <w:r>
+        <w:rPr>
+          <w:lang w:val="en-US"/>
+        </w:rPr>
+        <w:t>LTspice</w:t>
+      </w:r>
+      <w:proofErr w:type="spellEnd"/>
+      <w:r>
+        <w:rPr>
+          <w:lang w:val="en-US"/>
+        </w:rPr>
+        <w:t>:</w:t>
       </w:r>
     </w:p>
     <w:p>
@@ -2687,7 +2923,35 @@
         <w:rPr>
           <w:lang w:val="en-US"/>
         </w:rPr>
-        <w:t>OK, so not suitable for a very high speed interface, but OK for the Thermoino.</w:t>
+        <w:t xml:space="preserve">OK, so not suitable for a very </w:t>
+      </w:r>
+      <w:proofErr w:type="gramStart"/>
+      <w:r>
+        <w:rPr>
+          <w:lang w:val="en-US"/>
+        </w:rPr>
+        <w:t>high speed</w:t>
+      </w:r>
+      <w:proofErr w:type="gramEnd"/>
+      <w:r>
+        <w:rPr>
+          <w:lang w:val="en-US"/>
+        </w:rPr>
+        <w:t xml:space="preserve"> interface, but OK for the </w:t>
+      </w:r>
+      <w:proofErr w:type="spellStart"/>
+      <w:r>
+        <w:rPr>
+          <w:lang w:val="en-US"/>
+        </w:rPr>
+        <w:t>Thermoino</w:t>
+      </w:r>
+      <w:proofErr w:type="spellEnd"/>
+      <w:r>
+        <w:rPr>
+          <w:lang w:val="en-US"/>
+        </w:rPr>
+        <w:t>.</w:t>
       </w:r>
     </w:p>
     <w:p>
@@ -2702,30 +2966,60 @@
         </w:rPr>
         <w:t xml:space="preserve">Summary: All </w:t>
       </w:r>
-      <w:r>
-        <w:rPr>
-          <w:lang w:val="en-US"/>
-        </w:rPr>
-        <w:t xml:space="preserve">Thermoinos </w:t>
-      </w:r>
-      <w:r>
-        <w:rPr>
-          <w:lang w:val="en-US"/>
-        </w:rPr>
-        <w:t>need an overhaul and get new optocouplers !!</w:t>
-      </w:r>
-    </w:p>
-    <w:p>
-      <w:pPr>
-        <w:rPr>
-          <w:lang w:val="en-US"/>
-        </w:rPr>
-      </w:pPr>
-      <w:r>
-        <w:rPr>
-          <w:lang w:val="en-US"/>
-        </w:rPr>
-        <w:t>Now a real world example: the following CTC:</w:t>
+      <w:proofErr w:type="spellStart"/>
+      <w:r>
+        <w:rPr>
+          <w:lang w:val="en-US"/>
+        </w:rPr>
+        <w:t>Thermoinos</w:t>
+      </w:r>
+      <w:proofErr w:type="spellEnd"/>
+      <w:r>
+        <w:rPr>
+          <w:lang w:val="en-US"/>
+        </w:rPr>
+        <w:t xml:space="preserve"> </w:t>
+      </w:r>
+      <w:r>
+        <w:rPr>
+          <w:lang w:val="en-US"/>
+        </w:rPr>
+        <w:t xml:space="preserve">need an overhaul and get new </w:t>
+      </w:r>
+      <w:proofErr w:type="gramStart"/>
+      <w:r>
+        <w:rPr>
+          <w:lang w:val="en-US"/>
+        </w:rPr>
+        <w:t>optocouplers !!</w:t>
+      </w:r>
+      <w:proofErr w:type="gramEnd"/>
+    </w:p>
+    <w:p>
+      <w:pPr>
+        <w:rPr>
+          <w:lang w:val="en-US"/>
+        </w:rPr>
+      </w:pPr>
+      <w:r>
+        <w:rPr>
+          <w:lang w:val="en-US"/>
+        </w:rPr>
+        <w:t xml:space="preserve">Now a </w:t>
+      </w:r>
+      <w:proofErr w:type="gramStart"/>
+      <w:r>
+        <w:rPr>
+          <w:lang w:val="en-US"/>
+        </w:rPr>
+        <w:t>real world</w:t>
+      </w:r>
+      <w:proofErr w:type="gramEnd"/>
+      <w:r>
+        <w:rPr>
+          <w:lang w:val="en-US"/>
+        </w:rPr>
+        <w:t xml:space="preserve"> example: the following CTC:</w:t>
       </w:r>
     </w:p>
     <w:p>
@@ -2815,7 +3109,7 @@
           <w:lang w:eastAsia="de-DE"/>
         </w:rPr>
         <w:drawing>
-          <wp:inline distT="0" distB="0" distL="0" distR="0" wp14:anchorId="0F982661" wp14:editId="284DE1C1">
+          <wp:inline distT="0" distB="0" distL="0" distR="0" wp14:anchorId="0F982661" wp14:editId="0F31BE5A">
             <wp:extent cx="5760720" cy="3240405"/>
             <wp:effectExtent l="0" t="0" r="0" b="0"/>
             <wp:docPr id="26" name="Grafik 26" descr="C:\Users\buechel\Dropbox\DSC_0093.JPG"/>
@@ -3009,13 +3303,63 @@
         <w:rPr>
           <w:lang w:val="en-US"/>
         </w:rPr>
-        <w:t>READVAS returns the time in ms (like GETTIME) since the Thermoino has been powered-up</w:t>
-      </w:r>
-      <w:r>
-        <w:rPr>
-          <w:lang w:val="en-US"/>
-        </w:rPr>
-        <w:t xml:space="preserve"> and a reading of the potentiometer (0..1023)</w:t>
+        <w:t xml:space="preserve">READVAS returns the time in </w:t>
+      </w:r>
+      <w:proofErr w:type="spellStart"/>
+      <w:r>
+        <w:rPr>
+          <w:lang w:val="en-US"/>
+        </w:rPr>
+        <w:t>ms</w:t>
+      </w:r>
+      <w:proofErr w:type="spellEnd"/>
+      <w:r>
+        <w:rPr>
+          <w:lang w:val="en-US"/>
+        </w:rPr>
+        <w:t xml:space="preserve"> (like GETTIME) since the </w:t>
+      </w:r>
+      <w:proofErr w:type="spellStart"/>
+      <w:r>
+        <w:rPr>
+          <w:lang w:val="en-US"/>
+        </w:rPr>
+        <w:t>Thermoino</w:t>
+      </w:r>
+      <w:proofErr w:type="spellEnd"/>
+      <w:r>
+        <w:rPr>
+          <w:lang w:val="en-US"/>
+        </w:rPr>
+        <w:t xml:space="preserve"> has been </w:t>
+      </w:r>
+      <w:proofErr w:type="gramStart"/>
+      <w:r>
+        <w:rPr>
+          <w:lang w:val="en-US"/>
+        </w:rPr>
+        <w:t>powered-up</w:t>
+      </w:r>
+      <w:proofErr w:type="gramEnd"/>
+      <w:r>
+        <w:rPr>
+          <w:lang w:val="en-US"/>
+        </w:rPr>
+        <w:t xml:space="preserve"> and a reading of the potentiometer (</w:t>
+      </w:r>
+      <w:proofErr w:type="gramStart"/>
+      <w:r>
+        <w:rPr>
+          <w:lang w:val="en-US"/>
+        </w:rPr>
+        <w:t>0..</w:t>
+      </w:r>
+      <w:proofErr w:type="gramEnd"/>
+      <w:r>
+        <w:rPr>
+          <w:lang w:val="en-US"/>
+        </w:rPr>
+        <w:t>1023)</w:t>
       </w:r>
       <w:r>
         <w:rPr>
@@ -3033,7 +3377,21 @@
         <w:rPr>
           <w:lang w:val="en-US"/>
         </w:rPr>
-        <w:t>fere with EXECCTC, but will not interfere with EXECCTCPWM.</w:t>
+        <w:t xml:space="preserve">fere with </w:t>
+      </w:r>
+      <w:proofErr w:type="gramStart"/>
+      <w:r>
+        <w:rPr>
+          <w:lang w:val="en-US"/>
+        </w:rPr>
+        <w:t>EXECCTC, but</w:t>
+      </w:r>
+      <w:proofErr w:type="gramEnd"/>
+      <w:r>
+        <w:rPr>
+          <w:lang w:val="en-US"/>
+        </w:rPr>
+        <w:t xml:space="preserve"> will not interfere with EXECCTCPWM.</w:t>
       </w:r>
     </w:p>
     <w:p>
@@ -3085,7 +3443,7 @@
           <w:lang w:eastAsia="de-DE"/>
         </w:rPr>
         <w:drawing>
-          <wp:inline distT="0" distB="0" distL="0" distR="0" wp14:anchorId="21CF7B22" wp14:editId="4D253ACE">
+          <wp:inline distT="0" distB="0" distL="0" distR="0" wp14:anchorId="21CF7B22" wp14:editId="67ADBCD2">
             <wp:extent cx="5760720" cy="3240405"/>
             <wp:effectExtent l="0" t="0" r="0" b="0"/>
             <wp:docPr id="14" name="Grafik 14" descr="C:\Users\buechel\Dropbox\DSCPDC_0003_BURST20210519130452590_COVER.JPG"/>
@@ -3510,7 +3868,21 @@
         <w:rPr>
           <w:lang w:val="en-US"/>
         </w:rPr>
-        <w:t xml:space="preserve">All I/O now implemented through the fastIO tool as developed </w:t>
+        <w:t xml:space="preserve">All I/O now implemented through the </w:t>
+      </w:r>
+      <w:proofErr w:type="spellStart"/>
+      <w:r>
+        <w:rPr>
+          <w:lang w:val="en-US"/>
+        </w:rPr>
+        <w:t>fastIO</w:t>
+      </w:r>
+      <w:proofErr w:type="spellEnd"/>
+      <w:r>
+        <w:rPr>
+          <w:lang w:val="en-US"/>
+        </w:rPr>
+        <w:t xml:space="preserve"> tool as developed </w:t>
       </w:r>
       <w:r>
         <w:rPr>
@@ -3573,7 +3945,21 @@
         <w:rPr>
           <w:lang w:val="en-US"/>
         </w:rPr>
-        <w:t>Everything async now, even ramp_temp uses timer and interrupt</w:t>
+        <w:t xml:space="preserve">Everything async now, even </w:t>
+      </w:r>
+      <w:proofErr w:type="spellStart"/>
+      <w:r>
+        <w:rPr>
+          <w:lang w:val="en-US"/>
+        </w:rPr>
+        <w:t>ramp_temp</w:t>
+      </w:r>
+      <w:proofErr w:type="spellEnd"/>
+      <w:r>
+        <w:rPr>
+          <w:lang w:val="en-US"/>
+        </w:rPr>
+        <w:t xml:space="preserve"> uses timer and interrupt</w:t>
       </w:r>
     </w:p>
     <w:p>
@@ -3613,7 +3999,21 @@
         <w:rPr>
           <w:lang w:val="en-US"/>
         </w:rPr>
-        <w:t>No additional null pulse required for ctc (all done internally)</w:t>
+        <w:t xml:space="preserve">No additional null pulse required for </w:t>
+      </w:r>
+      <w:proofErr w:type="spellStart"/>
+      <w:r>
+        <w:rPr>
+          <w:lang w:val="en-US"/>
+        </w:rPr>
+        <w:t>ctc</w:t>
+      </w:r>
+      <w:proofErr w:type="spellEnd"/>
+      <w:r>
+        <w:rPr>
+          <w:lang w:val="en-US"/>
+        </w:rPr>
+        <w:t xml:space="preserve"> (all done internally)</w:t>
       </w:r>
     </w:p>
     <w:p>
@@ -3666,7 +4066,21 @@
         <w:rPr>
           <w:lang w:val="en-US"/>
         </w:rPr>
-        <w:t>Update 30.8.2025 (ver 3.5)</w:t>
+        <w:t>Update 30.8.2025 (</w:t>
+      </w:r>
+      <w:proofErr w:type="spellStart"/>
+      <w:r>
+        <w:rPr>
+          <w:lang w:val="en-US"/>
+        </w:rPr>
+        <w:t>ver</w:t>
+      </w:r>
+      <w:proofErr w:type="spellEnd"/>
+      <w:r>
+        <w:rPr>
+          <w:lang w:val="en-US"/>
+        </w:rPr>
+        <w:t xml:space="preserve"> 3.5)</w:t>
       </w:r>
     </w:p>
     <w:p>
@@ -3705,20 +4119,48 @@
         <w:rPr>
           <w:lang w:val="en-US"/>
         </w:rPr>
-        <w:t>Returns status for thermode and digitimer separately allowing for parallel operation</w:t>
-      </w:r>
-    </w:p>
-    <w:p>
-      <w:pPr>
-        <w:rPr>
-          <w:lang w:val="en-US"/>
-        </w:rPr>
-      </w:pPr>
-      <w:r>
-        <w:rPr>
-          <w:lang w:val="en-US"/>
-        </w:rPr>
-        <w:t>New interface code, more efficient and faster I/O (UseThermoinoPTB)</w:t>
+        <w:t xml:space="preserve">Returns status for thermode and </w:t>
+      </w:r>
+      <w:proofErr w:type="spellStart"/>
+      <w:r>
+        <w:rPr>
+          <w:lang w:val="en-US"/>
+        </w:rPr>
+        <w:t>digitimer</w:t>
+      </w:r>
+      <w:proofErr w:type="spellEnd"/>
+      <w:r>
+        <w:rPr>
+          <w:lang w:val="en-US"/>
+        </w:rPr>
+        <w:t xml:space="preserve"> separately allowing for parallel operation</w:t>
+      </w:r>
+    </w:p>
+    <w:p>
+      <w:pPr>
+        <w:rPr>
+          <w:lang w:val="en-US"/>
+        </w:rPr>
+      </w:pPr>
+      <w:r>
+        <w:rPr>
+          <w:lang w:val="en-US"/>
+        </w:rPr>
+        <w:t>New interface code, more efficient and faster I/O (</w:t>
+      </w:r>
+      <w:proofErr w:type="spellStart"/>
+      <w:r>
+        <w:rPr>
+          <w:lang w:val="en-US"/>
+        </w:rPr>
+        <w:t>UseThermoinoPTB</w:t>
+      </w:r>
+      <w:proofErr w:type="spellEnd"/>
+      <w:r>
+        <w:rPr>
+          <w:lang w:val="en-US"/>
+        </w:rPr>
+        <w:t>)</w:t>
       </w:r>
     </w:p>
     <w:p>
@@ -3926,7 +4368,21 @@
         <w:rPr>
           <w:lang w:val="en-US"/>
         </w:rPr>
-        <w:t>Now let’s see how bad it is using the old Optocouplers</w:t>
+        <w:t xml:space="preserve">Now let’s see how bad it is </w:t>
+      </w:r>
+      <w:proofErr w:type="gramStart"/>
+      <w:r>
+        <w:rPr>
+          <w:lang w:val="en-US"/>
+        </w:rPr>
+        <w:t>using</w:t>
+      </w:r>
+      <w:proofErr w:type="gramEnd"/>
+      <w:r>
+        <w:rPr>
+          <w:lang w:val="en-US"/>
+        </w:rPr>
+        <w:t xml:space="preserve"> the old Optocouplers</w:t>
       </w:r>
     </w:p>
     <w:p>
@@ -3994,8 +4450,16 @@
         <w:rPr>
           <w:lang w:val="en-US"/>
         </w:rPr>
-        <w:t>The same !!!</w:t>
-      </w:r>
+        <w:t xml:space="preserve">The </w:t>
+      </w:r>
+      <w:proofErr w:type="gramStart"/>
+      <w:r>
+        <w:rPr>
+          <w:lang w:val="en-US"/>
+        </w:rPr>
+        <w:t>same !!!</w:t>
+      </w:r>
+      <w:proofErr w:type="gramEnd"/>
     </w:p>
     <w:p>
       <w:pPr>
@@ -4076,7 +4540,21 @@
         <w:rPr>
           <w:lang w:val="en-US"/>
         </w:rPr>
-        <w:t>Note 5ms time base, but the timing is essentially the same the signal recovers after about 5ms</w:t>
+        <w:t xml:space="preserve">Note 5ms time base, but the timing is essentially the </w:t>
+      </w:r>
+      <w:proofErr w:type="gramStart"/>
+      <w:r>
+        <w:rPr>
+          <w:lang w:val="en-US"/>
+        </w:rPr>
+        <w:t>same</w:t>
+      </w:r>
+      <w:proofErr w:type="gramEnd"/>
+      <w:r>
+        <w:rPr>
+          <w:lang w:val="en-US"/>
+        </w:rPr>
+        <w:t xml:space="preserve"> the signal recovers after about 5ms</w:t>
       </w:r>
     </w:p>
     <w:p>
@@ -4126,11 +4604,47 @@
           <w:lang w:val="en-US"/>
         </w:rPr>
       </w:pPr>
-      <w:r>
-        <w:rPr>
-          <w:lang w:val="en-US"/>
-        </w:rPr>
-        <w:t>Now has support for the D188 electrode multiplexer box and sends 4-bit coded data to a Sub-D 25. The command is D188;xx where xx is the channel you want (0..8) and 0 means off</w:t>
+      <w:proofErr w:type="gramStart"/>
+      <w:r>
+        <w:rPr>
+          <w:lang w:val="en-US"/>
+        </w:rPr>
+        <w:t>Now</w:t>
+      </w:r>
+      <w:proofErr w:type="gramEnd"/>
+      <w:r>
+        <w:rPr>
+          <w:lang w:val="en-US"/>
+        </w:rPr>
+        <w:t xml:space="preserve"> has support for the D188 electrode multiplexer box and sends 4-bit coded data to a Sub-D 25. The command is D</w:t>
+      </w:r>
+      <w:proofErr w:type="gramStart"/>
+      <w:r>
+        <w:rPr>
+          <w:lang w:val="en-US"/>
+        </w:rPr>
+        <w:t>188;xx</w:t>
+      </w:r>
+      <w:proofErr w:type="gramEnd"/>
+      <w:r>
+        <w:rPr>
+          <w:lang w:val="en-US"/>
+        </w:rPr>
+        <w:t xml:space="preserve"> where xx is the channel you want (</w:t>
+      </w:r>
+      <w:proofErr w:type="gramStart"/>
+      <w:r>
+        <w:rPr>
+          <w:lang w:val="en-US"/>
+        </w:rPr>
+        <w:t>0..</w:t>
+      </w:r>
+      <w:proofErr w:type="gramEnd"/>
+      <w:r>
+        <w:rPr>
+          <w:lang w:val="en-US"/>
+        </w:rPr>
+        <w:t>8) and 0 means off</w:t>
       </w:r>
       <w:r>
         <w:rPr>
@@ -4185,7 +4699,51 @@
         <w:rPr>
           <w:lang w:val="en-US"/>
         </w:rPr>
-        <w:t>). This works quite nicely and uses the command SETV;xx where xx is the voltage in mV (0..10000). This uses wire.h and thus hardware I2C</w:t>
+        <w:t xml:space="preserve">). This works quite nicely and uses the command </w:t>
+      </w:r>
+      <w:proofErr w:type="spellStart"/>
+      <w:proofErr w:type="gramStart"/>
+      <w:r>
+        <w:rPr>
+          <w:lang w:val="en-US"/>
+        </w:rPr>
+        <w:t>SETV;xx</w:t>
+      </w:r>
+      <w:proofErr w:type="spellEnd"/>
+      <w:proofErr w:type="gramEnd"/>
+      <w:r>
+        <w:rPr>
+          <w:lang w:val="en-US"/>
+        </w:rPr>
+        <w:t xml:space="preserve"> where xx is the voltage in mV (</w:t>
+      </w:r>
+      <w:proofErr w:type="gramStart"/>
+      <w:r>
+        <w:rPr>
+          <w:lang w:val="en-US"/>
+        </w:rPr>
+        <w:t>0..</w:t>
+      </w:r>
+      <w:proofErr w:type="gramEnd"/>
+      <w:r>
+        <w:rPr>
+          <w:lang w:val="en-US"/>
+        </w:rPr>
+        <w:t xml:space="preserve">10000). This uses </w:t>
+      </w:r>
+      <w:proofErr w:type="spellStart"/>
+      <w:r>
+        <w:rPr>
+          <w:lang w:val="en-US"/>
+        </w:rPr>
+        <w:t>wire.h</w:t>
+      </w:r>
+      <w:proofErr w:type="spellEnd"/>
+      <w:r>
+        <w:rPr>
+          <w:lang w:val="en-US"/>
+        </w:rPr>
+        <w:t xml:space="preserve"> and thus hardware I2C</w:t>
       </w:r>
       <w:r>
         <w:rPr>
@@ -4364,6 +4922,367 @@
           <w:lang w:val="en-US"/>
         </w:rPr>
         <w:t>And back to 0V. Reasonable timing, I guess it is safe to wait for 1ms then the voltage should have settled</w:t>
+      </w:r>
+    </w:p>
+    <w:p>
+      <w:pPr>
+        <w:pStyle w:val="berschrift1"/>
+        <w:rPr>
+          <w:lang w:val="en-US"/>
+        </w:rPr>
+      </w:pPr>
+      <w:r>
+        <w:rPr>
+          <w:lang w:val="en-US"/>
+        </w:rPr>
+        <w:t>Update 9.2.26</w:t>
+      </w:r>
+    </w:p>
+    <w:p>
+      <w:pPr>
+        <w:rPr>
+          <w:lang w:val="en-US"/>
+        </w:rPr>
+      </w:pPr>
+      <w:r>
+        <w:rPr>
+          <w:lang w:val="en-US"/>
+        </w:rPr>
+        <w:t>We have now added a SEQU feature to set the D188 channel, set the voltage of the DAC and parametrize the shocks in 1 command. In a first step a struct array is filled with these values and in a 2</w:t>
+      </w:r>
+      <w:r>
+        <w:rPr>
+          <w:vertAlign w:val="superscript"/>
+          <w:lang w:val="en-US"/>
+        </w:rPr>
+        <w:t>nd</w:t>
+      </w:r>
+      <w:r>
+        <w:rPr>
+          <w:lang w:val="en-US"/>
+        </w:rPr>
+        <w:t xml:space="preserve"> step the sequence is executed. For that I have also changed the Timer3 behavior. The old version had a long deadtime before the 1</w:t>
+      </w:r>
+      <w:r>
+        <w:rPr>
+          <w:vertAlign w:val="superscript"/>
+          <w:lang w:val="en-US"/>
+        </w:rPr>
+        <w:t>st</w:t>
+      </w:r>
+      <w:r>
+        <w:rPr>
+          <w:lang w:val="en-US"/>
+        </w:rPr>
+        <w:t xml:space="preserve"> pulse and a long </w:t>
+      </w:r>
+      <w:proofErr w:type="spellStart"/>
+      <w:r>
+        <w:rPr>
+          <w:lang w:val="en-US"/>
+        </w:rPr>
+        <w:t>deadtiume</w:t>
+      </w:r>
+      <w:proofErr w:type="spellEnd"/>
+      <w:r>
+        <w:rPr>
+          <w:lang w:val="en-US"/>
+        </w:rPr>
+        <w:t xml:space="preserve"> after the last (the OVF ISR was only called when TCNT reached bottom, which was ½ a </w:t>
+      </w:r>
+      <w:proofErr w:type="spellStart"/>
+      <w:r>
+        <w:rPr>
+          <w:lang w:val="en-US"/>
+        </w:rPr>
+        <w:t>cyle</w:t>
+      </w:r>
+      <w:proofErr w:type="spellEnd"/>
+      <w:r>
+        <w:rPr>
+          <w:lang w:val="en-US"/>
+        </w:rPr>
+        <w:t xml:space="preserve"> after the pulse). </w:t>
+      </w:r>
+    </w:p>
+    <w:p>
+      <w:pPr>
+        <w:rPr>
+          <w:lang w:val="en-US"/>
+        </w:rPr>
+      </w:pPr>
+      <w:r>
+        <w:rPr>
+          <w:lang w:val="en-US"/>
+        </w:rPr>
+        <w:lastRenderedPageBreak/>
+        <w:t xml:space="preserve">I now use phase correct PWM as </w:t>
+      </w:r>
+      <w:proofErr w:type="gramStart"/>
+      <w:r>
+        <w:rPr>
+          <w:lang w:val="en-US"/>
+        </w:rPr>
+        <w:t>before, but</w:t>
+      </w:r>
+      <w:proofErr w:type="gramEnd"/>
+      <w:r>
+        <w:rPr>
+          <w:lang w:val="en-US"/>
+        </w:rPr>
+        <w:t xml:space="preserve"> set TCNT to TOP (defined by ICR). This means that a pulse is generated right away. To control the number of pulses I now use the OCRA match ISR. This needs a little care, as OCRA is passed on the up and the down slope. However, the 1</w:t>
+      </w:r>
+      <w:r>
+        <w:rPr>
+          <w:vertAlign w:val="superscript"/>
+          <w:lang w:val="en-US"/>
+        </w:rPr>
+        <w:t>st</w:t>
+      </w:r>
+      <w:r>
+        <w:rPr>
+          <w:lang w:val="en-US"/>
+        </w:rPr>
+        <w:t xml:space="preserve"> pulse is only ½ as OCRA is updated at TOP (ICR). </w:t>
+      </w:r>
+      <w:proofErr w:type="gramStart"/>
+      <w:r>
+        <w:rPr>
+          <w:lang w:val="en-US"/>
+        </w:rPr>
+        <w:t>So</w:t>
+      </w:r>
+      <w:proofErr w:type="gramEnd"/>
+      <w:r>
+        <w:rPr>
+          <w:lang w:val="en-US"/>
+        </w:rPr>
+        <w:t xml:space="preserve"> we simply initialize TCNT with TOP (ICR). Initially I thought initializing TCNT with a bit before the upslope OCRA value would give me a nice 1</w:t>
+      </w:r>
+      <w:r>
+        <w:rPr>
+          <w:vertAlign w:val="superscript"/>
+          <w:lang w:val="en-US"/>
+        </w:rPr>
+        <w:t>st</w:t>
+      </w:r>
+      <w:r>
+        <w:rPr>
+          <w:lang w:val="en-US"/>
+        </w:rPr>
+        <w:t xml:space="preserve"> pulse, but the problem is that the OCRA value is only buffered and once TCNT hits TOP it is put in the real OCRA register. Example below shows 2 Pulses. Blue arrow shows </w:t>
+      </w:r>
+      <w:proofErr w:type="gramStart"/>
+      <w:r>
+        <w:rPr>
+          <w:lang w:val="en-US"/>
+        </w:rPr>
+        <w:t>start,</w:t>
+      </w:r>
+      <w:proofErr w:type="gramEnd"/>
+      <w:r>
+        <w:rPr>
+          <w:lang w:val="en-US"/>
+        </w:rPr>
+        <w:t xml:space="preserve"> red arrow shows end</w:t>
+      </w:r>
+      <w:r>
+        <w:rPr>
+          <w:lang w:val="en-US"/>
+        </w:rPr>
+        <w:t>. The DS8R requires a min of 5µs so the error is small.</w:t>
+      </w:r>
+    </w:p>
+    <w:p>
+      <w:pPr>
+        <w:rPr>
+          <w:lang w:val="en-US"/>
+        </w:rPr>
+      </w:pPr>
+      <w:r>
+        <w:rPr>
+          <w:noProof/>
+        </w:rPr>
+        <mc:AlternateContent>
+          <mc:Choice Requires="wps">
+            <w:drawing>
+              <wp:anchor distT="0" distB="0" distL="114300" distR="114300" simplePos="0" relativeHeight="251661312" behindDoc="0" locked="0" layoutInCell="1" allowOverlap="1" wp14:anchorId="4654319E" wp14:editId="42BCD1F4">
+                <wp:simplePos x="0" y="0"/>
+                <wp:positionH relativeFrom="column">
+                  <wp:posOffset>3634105</wp:posOffset>
+                </wp:positionH>
+                <wp:positionV relativeFrom="paragraph">
+                  <wp:posOffset>286385</wp:posOffset>
+                </wp:positionV>
+                <wp:extent cx="307340" cy="551180"/>
+                <wp:effectExtent l="38100" t="0" r="35560" b="58420"/>
+                <wp:wrapNone/>
+                <wp:docPr id="1767356186" name="Gerade Verbindung mit Pfeil 1"/>
+                <wp:cNvGraphicFramePr/>
+                <a:graphic xmlns:a="http://schemas.openxmlformats.org/drawingml/2006/main">
+                  <a:graphicData uri="http://schemas.microsoft.com/office/word/2010/wordprocessingShape">
+                    <wps:wsp>
+                      <wps:cNvCnPr/>
+                      <wps:spPr>
+                        <a:xfrm flipH="1">
+                          <a:off x="0" y="0"/>
+                          <a:ext cx="307340" cy="551180"/>
+                        </a:xfrm>
+                        <a:prstGeom prst="straightConnector1">
+                          <a:avLst/>
+                        </a:prstGeom>
+                        <a:ln>
+                          <a:solidFill>
+                            <a:srgbClr val="FF0000"/>
+                          </a:solidFill>
+                          <a:tailEnd type="triangle"/>
+                        </a:ln>
+                      </wps:spPr>
+                      <wps:style>
+                        <a:lnRef idx="1">
+                          <a:schemeClr val="accent1"/>
+                        </a:lnRef>
+                        <a:fillRef idx="0">
+                          <a:schemeClr val="accent1"/>
+                        </a:fillRef>
+                        <a:effectRef idx="0">
+                          <a:schemeClr val="accent1"/>
+                        </a:effectRef>
+                        <a:fontRef idx="minor">
+                          <a:schemeClr val="tx1"/>
+                        </a:fontRef>
+                      </wps:style>
+                      <wps:bodyPr/>
+                    </wps:wsp>
+                  </a:graphicData>
+                </a:graphic>
+                <wp14:sizeRelH relativeFrom="margin">
+                  <wp14:pctWidth>0</wp14:pctWidth>
+                </wp14:sizeRelH>
+                <wp14:sizeRelV relativeFrom="margin">
+                  <wp14:pctHeight>0</wp14:pctHeight>
+                </wp14:sizeRelV>
+              </wp:anchor>
+            </w:drawing>
+          </mc:Choice>
+          <mc:Fallback>
+            <w:pict>
+              <v:shapetype w14:anchorId="6507B524" id="_x0000_t32" coordsize="21600,21600" o:spt="32" o:oned="t" path="m,l21600,21600e" filled="f">
+                <v:path arrowok="t" fillok="f" o:connecttype="none"/>
+                <o:lock v:ext="edit" shapetype="t"/>
+              </v:shapetype>
+              <v:shape id="Gerade Verbindung mit Pfeil 1" o:spid="_x0000_s1026" type="#_x0000_t32" style="position:absolute;margin-left:286.15pt;margin-top:22.55pt;width:24.2pt;height:43.4pt;flip:x;z-index:251661312;visibility:visible;mso-wrap-style:square;mso-width-percent:0;mso-height-percent:0;mso-wrap-distance-left:9pt;mso-wrap-distance-top:0;mso-wrap-distance-right:9pt;mso-wrap-distance-bottom:0;mso-position-horizontal:absolute;mso-position-horizontal-relative:text;mso-position-vertical:absolute;mso-position-vertical-relative:text;mso-width-percent:0;mso-height-percent:0;mso-width-relative:margin;mso-height-relative:margin" o:gfxdata="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" strokecolor="red" strokeweight=".5pt">
+                <v:stroke endarrow="block" joinstyle="miter"/>
+              </v:shape>
+            </w:pict>
+          </mc:Fallback>
+        </mc:AlternateContent>
+      </w:r>
+      <w:r>
+        <w:rPr>
+          <w:noProof/>
+        </w:rPr>
+        <mc:AlternateContent>
+          <mc:Choice Requires="wps">
+            <w:drawing>
+              <wp:anchor distT="0" distB="0" distL="114300" distR="114300" simplePos="0" relativeHeight="251659264" behindDoc="0" locked="0" layoutInCell="1" allowOverlap="1" wp14:anchorId="5FDF4FDC" wp14:editId="3FA18484">
+                <wp:simplePos x="0" y="0"/>
+                <wp:positionH relativeFrom="column">
+                  <wp:posOffset>1254125</wp:posOffset>
+                </wp:positionH>
+                <wp:positionV relativeFrom="paragraph">
+                  <wp:posOffset>1693545</wp:posOffset>
+                </wp:positionV>
+                <wp:extent cx="35560" cy="523240"/>
+                <wp:effectExtent l="38100" t="38100" r="59690" b="10160"/>
+                <wp:wrapNone/>
+                <wp:docPr id="1972117166" name="Gerade Verbindung mit Pfeil 1"/>
+                <wp:cNvGraphicFramePr/>
+                <a:graphic xmlns:a="http://schemas.openxmlformats.org/drawingml/2006/main">
+                  <a:graphicData uri="http://schemas.microsoft.com/office/word/2010/wordprocessingShape">
+                    <wps:wsp>
+                      <wps:cNvCnPr/>
+                      <wps:spPr>
+                        <a:xfrm flipV="1">
+                          <a:off x="0" y="0"/>
+                          <a:ext cx="35560" cy="523240"/>
+                        </a:xfrm>
+                        <a:prstGeom prst="straightConnector1">
+                          <a:avLst/>
+                        </a:prstGeom>
+                        <a:ln>
+                          <a:tailEnd type="triangle"/>
+                        </a:ln>
+                      </wps:spPr>
+                      <wps:style>
+                        <a:lnRef idx="1">
+                          <a:schemeClr val="accent1"/>
+                        </a:lnRef>
+                        <a:fillRef idx="0">
+                          <a:schemeClr val="accent1"/>
+                        </a:fillRef>
+                        <a:effectRef idx="0">
+                          <a:schemeClr val="accent1"/>
+                        </a:effectRef>
+                        <a:fontRef idx="minor">
+                          <a:schemeClr val="tx1"/>
+                        </a:fontRef>
+                      </wps:style>
+                      <wps:bodyPr/>
+                    </wps:wsp>
+                  </a:graphicData>
+                </a:graphic>
+              </wp:anchor>
+            </w:drawing>
+          </mc:Choice>
+          <mc:Fallback>
+            <w:pict>
+              <v:shape w14:anchorId="0E333ED2" id="Gerade Verbindung mit Pfeil 1" o:spid="_x0000_s1026" type="#_x0000_t32" style="position:absolute;margin-left:98.75pt;margin-top:133.35pt;width:2.8pt;height:41.2pt;flip:y;z-index:251659264;visibility:visible;mso-wrap-style:square;mso-wrap-distance-left:9pt;mso-wrap-distance-top:0;mso-wrap-distance-right:9pt;mso-wrap-distance-bottom:0;mso-position-horizontal:absolute;mso-position-horizontal-relative:text;mso-position-vertical:absolute;mso-position-vertical-relative:text" o:gfxdata="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" strokecolor="#5b9bd5 [3204]" strokeweight=".5pt">
+                <v:stroke endarrow="block" joinstyle="miter"/>
+              </v:shape>
+            </w:pict>
+          </mc:Fallback>
+        </mc:AlternateContent>
+      </w:r>
+      <w:r>
+        <w:rPr>
+          <w:noProof/>
+        </w:rPr>
+        <w:drawing>
+          <wp:inline distT="0" distB="0" distL="0" distR="0" wp14:anchorId="02104E55" wp14:editId="71A73DA5">
+            <wp:extent cx="5760720" cy="1896110"/>
+            <wp:effectExtent l="0" t="0" r="0" b="8890"/>
+            <wp:docPr id="2119099126" name="Grafik 1" descr="Ein Bild, das Text, Reihe, Diagramm, Zahl enthält.&#10;&#10;KI-generierte Inhalte können fehlerhaft sein."/>
+            <wp:cNvGraphicFramePr>
+              <a:graphicFrameLocks xmlns:a="http://schemas.openxmlformats.org/drawingml/2006/main" noChangeAspect="1"/>
+            </wp:cNvGraphicFramePr>
+            <a:graphic xmlns:a="http://schemas.openxmlformats.org/drawingml/2006/main">
+              <a:graphicData uri="http://schemas.openxmlformats.org/drawingml/2006/picture">
+                <pic:pic xmlns:pic="http://schemas.openxmlformats.org/drawingml/2006/picture">
+                  <pic:nvPicPr>
+                    <pic:cNvPr id="2119099126" name="Grafik 1" descr="Ein Bild, das Text, Reihe, Diagramm, Zahl enthält.&#10;&#10;KI-generierte Inhalte können fehlerhaft sein."/>
+                    <pic:cNvPicPr/>
+                  </pic:nvPicPr>
+                  <pic:blipFill>
+                    <a:blip r:embed="rId37"/>
+                    <a:stretch>
+                      <a:fillRect/>
+                    </a:stretch>
+                  </pic:blipFill>
+                  <pic:spPr>
+                    <a:xfrm>
+                      <a:off x="0" y="0"/>
+                      <a:ext cx="5760720" cy="1896110"/>
+                    </a:xfrm>
+                    <a:prstGeom prst="rect">
+                      <a:avLst/>
+                    </a:prstGeom>
+                  </pic:spPr>
+                </pic:pic>
+              </a:graphicData>
+            </a:graphic>
+          </wp:inline>
+        </w:drawing>
       </w:r>
     </w:p>
     <w:sectPr>
@@ -4871,6 +5790,7 @@
   <w:style w:type="character" w:default="1" w:styleId="Absatz-Standardschriftart">
     <w:name w:val="Default Paragraph Font"/>
     <w:uiPriority w:val="1"/>
+    <w:semiHidden/>
     <w:unhideWhenUsed/>
   </w:style>
   <w:style w:type="table" w:default="1" w:styleId="NormaleTabelle">

</xml_diff>